<commit_message>
Rewrite the Level 4 listening lines the checker rejected
</commit_message>
<xml_diff>
--- a/level4/curriculum/Level4_Lesson10.docx
+++ b/level4/curriculum/Level4_Lesson10.docx
@@ -4777,7 +4777,7 @@
                 <w:i w:val="0"/>
                 <w:sz w:val="23"/>
               </w:rPr>
-              <w:t>gonna</w:t>
+              <w:t>going to</w:t>
             </w:r>
             <w:r>
               <w:rPr>
@@ -4847,7 +4847,7 @@
                 <w:i w:val="0"/>
                 <w:sz w:val="23"/>
               </w:rPr>
-              <w:t xml:space="preserve"> read the script aloud with a volunteer (about 2:07), at a natural speed, two times. Say </w:t>
+              <w:t xml:space="preserve"> read the script aloud with a volunteer (about 2:05), at a natural speed, two times. The script says </w:t>
             </w:r>
             <w:r>
               <w:rPr>
@@ -4855,7 +4855,7 @@
                 <w:i/>
                 <w:sz w:val="23"/>
               </w:rPr>
-              <w:t>gonna</w:t>
+              <w:t>going to</w:t>
             </w:r>
             <w:r>
               <w:rPr>
@@ -4871,6 +4871,38 @@
                 <w:i/>
                 <w:sz w:val="23"/>
               </w:rPr>
+              <w:t>want to</w:t>
+            </w:r>
+            <w:r>
+              <w:rPr>
+                <w:b w:val="0"/>
+                <w:i w:val="0"/>
+                <w:sz w:val="23"/>
+              </w:rPr>
+              <w:t xml:space="preserve">. People often say </w:t>
+            </w:r>
+            <w:r>
+              <w:rPr>
+                <w:b w:val="0"/>
+                <w:i/>
+                <w:sz w:val="23"/>
+              </w:rPr>
+              <w:t>gonna</w:t>
+            </w:r>
+            <w:r>
+              <w:rPr>
+                <w:b w:val="0"/>
+                <w:i w:val="0"/>
+                <w:sz w:val="23"/>
+              </w:rPr>
+              <w:t xml:space="preserve"> and </w:t>
+            </w:r>
+            <w:r>
+              <w:rPr>
+                <w:b w:val="0"/>
+                <w:i/>
+                <w:sz w:val="23"/>
+              </w:rPr>
               <w:t>wanna</w:t>
             </w:r>
             <w:r>
@@ -4879,7 +4911,7 @@
                 <w:i w:val="0"/>
                 <w:sz w:val="23"/>
               </w:rPr>
-              <w:t xml:space="preserve"> where the script has them. When the audio is ready, it plays the conversation once; press play again for play 2. A third play is fine if the class needs it.</w:t>
+              <w:t>; learners only need to recognize those words. When the audio is ready, it plays the conversation once; press play again for play 2. A third play is fine if the class needs it.</w:t>
             </w:r>
           </w:p>
           <w:p>
@@ -6564,7 +6596,7 @@
           <w:color w:val="1B6F7A"/>
           <w:sz w:val="30"/>
         </w:rPr>
-        <w:t>Listening script (not recorded yet; about 2:07 when recorded; the conversation plays once, so press play again for the second listen)</w:t>
+        <w:t>Listening script (not recorded yet; about 2:05 when recorded; the conversation plays once, so press play again for the second listen)</w:t>
       </w:r>
     </w:p>
     <w:tbl>
@@ -6613,7 +6645,7 @@
                 <w:i w:val="0"/>
                 <w:sz w:val="22"/>
               </w:rPr>
-              <w:t xml:space="preserve"> the recording is coming soon. Until then, read the script aloud two times, with a volunteer if you can, at a natural, friendly speed. Say </w:t>
+              <w:t xml:space="preserve"> the recording is coming soon. Until then, read the script aloud two times, with a volunteer if you can, at a natural, friendly speed. The script says </w:t>
             </w:r>
             <w:r>
               <w:rPr>
@@ -6621,7 +6653,7 @@
                 <w:i/>
                 <w:sz w:val="22"/>
               </w:rPr>
-              <w:t>gonna</w:t>
+              <w:t>going to</w:t>
             </w:r>
             <w:r>
               <w:rPr>
@@ -6637,6 +6669,38 @@
                 <w:i/>
                 <w:sz w:val="22"/>
               </w:rPr>
+              <w:t>want to</w:t>
+            </w:r>
+            <w:r>
+              <w:rPr>
+                <w:b w:val="0"/>
+                <w:i w:val="0"/>
+                <w:sz w:val="22"/>
+              </w:rPr>
+              <w:t xml:space="preserve">. People often say </w:t>
+            </w:r>
+            <w:r>
+              <w:rPr>
+                <w:b w:val="0"/>
+                <w:i/>
+                <w:sz w:val="22"/>
+              </w:rPr>
+              <w:t>gonna</w:t>
+            </w:r>
+            <w:r>
+              <w:rPr>
+                <w:b w:val="0"/>
+                <w:i w:val="0"/>
+                <w:sz w:val="22"/>
+              </w:rPr>
+              <w:t xml:space="preserve"> and </w:t>
+            </w:r>
+            <w:r>
+              <w:rPr>
+                <w:b w:val="0"/>
+                <w:i/>
+                <w:sz w:val="22"/>
+              </w:rPr>
               <w:t>wanna</w:t>
             </w:r>
             <w:r>
@@ -6645,7 +6709,7 @@
                 <w:i w:val="0"/>
                 <w:sz w:val="22"/>
               </w:rPr>
-              <w:t xml:space="preserve"> where the script has them.</w:t>
+              <w:t>; learners only need to recognize those words.</w:t>
             </w:r>
           </w:p>
         </w:tc>
@@ -6707,7 +6771,7 @@
                 <w:i w:val="0"/>
                 <w:sz w:val="22"/>
               </w:rPr>
-              <w:t xml:space="preserve"> Lesson ten. Two roommates, Sofia and Hana, look at their electric bill. Then Sofia calls the electric company.</w:t>
+              <w:t xml:space="preserve"> Lesson ten. The two roommates look at their power bill. Then Sofia calls the electric company.</w:t>
             </w:r>
           </w:p>
           <w:p>
@@ -6728,7 +6792,7 @@
                 <w:i w:val="0"/>
                 <w:sz w:val="22"/>
               </w:rPr>
-              <w:t xml:space="preserve"> Hana, look at this. Our electric bill is one hundred and forty-two dollars this month!</w:t>
+              <w:t xml:space="preserve"> Hana, look at this. Our power bill is $142 this month!</w:t>
             </w:r>
           </w:p>
           <w:p>
@@ -6749,7 +6813,7 @@
                 <w:i w:val="0"/>
                 <w:sz w:val="22"/>
               </w:rPr>
-              <w:t xml:space="preserve"> What? Last month it was ninety dollars. Why is it so high?</w:t>
+              <w:t xml:space="preserve"> Last month it was only $90. Why is it so high?</w:t>
             </w:r>
           </w:p>
           <w:p>
@@ -6833,7 +6897,7 @@
                 <w:i w:val="0"/>
                 <w:sz w:val="22"/>
               </w:rPr>
-              <w:t xml:space="preserve"> Good idea. And I'm gonna unplug my phone charger in the morning. It uses electricity all day.</w:t>
+              <w:t xml:space="preserve"> Good idea. And I'm going to unplug my phone charger in the morning. It uses electricity all day.</w:t>
             </w:r>
           </w:p>
           <w:p>
@@ -7791,7 +7855,7 @@
           <w:i w:val="0"/>
           <w:sz w:val="23"/>
         </w:rPr>
-        <w:t xml:space="preserve"> the listening has </w:t>
+        <w:t xml:space="preserve"> the listening says </w:t>
       </w:r>
       <w:r>
         <w:rPr>
@@ -7799,7 +7863,7 @@
           <w:i/>
           <w:sz w:val="23"/>
         </w:rPr>
-        <w:t>gonna</w:t>
+        <w:t>going to</w:t>
       </w:r>
       <w:r>
         <w:rPr>
@@ -7807,7 +7871,7 @@
           <w:i w:val="0"/>
           <w:sz w:val="23"/>
         </w:rPr>
-        <w:t xml:space="preserve">. Learners need to understand it; they can always say </w:t>
+        <w:t xml:space="preserve">. People often say </w:t>
       </w:r>
       <w:r>
         <w:rPr>
@@ -7815,7 +7879,7 @@
           <w:i/>
           <w:sz w:val="23"/>
         </w:rPr>
-        <w:t>going to</w:t>
+        <w:t>gonna</w:t>
       </w:r>
       <w:r>
         <w:rPr>
@@ -7823,7 +7887,7 @@
           <w:i w:val="0"/>
           <w:sz w:val="23"/>
         </w:rPr>
-        <w:t>.</w:t>
+        <w:t>. Learners only need to recognize it; they can always say the full form.</w:t>
       </w:r>
     </w:p>
     <w:p>
@@ -10997,7 +11061,7 @@
           <w:i w:val="0"/>
           <w:sz w:val="26"/>
         </w:rPr>
-        <w:t>gonna</w:t>
+        <w:t>going to</w:t>
       </w:r>
       <w:r>
         <w:rPr>

</xml_diff>

<commit_message>
Rewrite the six Level 4 lines that failed again
</commit_message>
<xml_diff>
--- a/level4/curriculum/Level4_Lesson10.docx
+++ b/level4/curriculum/Level4_Lesson10.docx
@@ -4847,7 +4847,7 @@
                 <w:i w:val="0"/>
                 <w:sz w:val="23"/>
               </w:rPr>
-              <w:t xml:space="preserve"> read the script aloud with a volunteer (about 2:05), at a natural speed, two times. The script says </w:t>
+              <w:t xml:space="preserve"> read the script aloud with a volunteer (about 2:06), at a natural speed, two times. The script says </w:t>
             </w:r>
             <w:r>
               <w:rPr>
@@ -6596,7 +6596,7 @@
           <w:color w:val="1B6F7A"/>
           <w:sz w:val="30"/>
         </w:rPr>
-        <w:t>Listening script (not recorded yet; about 2:05 when recorded; the conversation plays once, so press play again for the second listen)</w:t>
+        <w:t>Listening script (not recorded yet; about 2:06 when recorded; the conversation plays once, so press play again for the second listen)</w:t>
       </w:r>
     </w:p>
     <w:tbl>
@@ -6792,7 +6792,7 @@
                 <w:i w:val="0"/>
                 <w:sz w:val="22"/>
               </w:rPr>
-              <w:t xml:space="preserve"> Hana, look at this. Our power bill is $142 this month!</w:t>
+              <w:t xml:space="preserve"> Hana, look at this. Our power bill is one forty-two dollars this month!</w:t>
             </w:r>
           </w:p>
           <w:p>

</xml_diff>